<commit_message>
Remove horizontal rule that we cannot easily add alt text to in Word
</commit_message>
<xml_diff>
--- a/docassemble/MAPetitionToSealEviction/data/templates/notice_of_hearing.docx
+++ b/docassemble/MAPetitionToSealEviction/data/templates/notice_of_hearing.docx
@@ -1,6 +1,6 @@
 
 <file path=word/document.xml><?xml version="1.0" encoding="utf-8"?>
-<w:document xmlns:wpc="http://schemas.microsoft.com/office/word/2010/wordprocessingCanvas" xmlns:cx="http://schemas.microsoft.com/office/drawing/2014/chartex" xmlns:cx1="http://schemas.microsoft.com/office/drawing/2015/9/8/chartex" xmlns:cx2="http://schemas.microsoft.com/office/drawing/2015/10/21/chartex" xmlns:cx3="http://schemas.microsoft.com/office/drawing/2016/5/9/chartex" xmlns:cx4="http://schemas.microsoft.com/office/drawing/2016/5/10/chartex" xmlns:cx5="http://schemas.microsoft.com/office/drawing/2016/5/11/chartex" xmlns:cx6="http://schemas.microsoft.com/office/drawing/2016/5/12/chartex" xmlns:cx7="http://schemas.microsoft.com/office/drawing/2016/5/13/chartex" xmlns:cx8="http://schemas.microsoft.com/office/drawing/2016/5/14/chartex" xmlns:mc="http://schemas.openxmlformats.org/markup-compatibility/2006" xmlns:aink="http://schemas.microsoft.com/office/drawing/2016/ink" xmlns:am3d="http://schemas.microsoft.com/office/drawing/2017/model3d" xmlns:o="urn:schemas-microsoft-com:office:office" xmlns:oel="http://schemas.microsoft.com/office/2019/extlst" xmlns:r="http://schemas.openxmlformats.org/officeDocument/2006/relationships" xmlns:m="http://schemas.openxmlformats.org/officeDocument/2006/math" xmlns:v="urn:schemas-microsoft-com:vml" xmlns:wp14="http://schemas.microsoft.com/office/word/2010/wordprocessingDrawing" xmlns:wp="http://schemas.openxmlformats.org/drawingml/2006/wordprocessingDrawing" xmlns:w10="urn:schemas-microsoft-com:office:word" xmlns:w="http://schemas.openxmlformats.org/wordprocessingml/2006/main" xmlns:w14="http://schemas.microsoft.com/office/word/2010/wordml" xmlns:w15="http://schemas.microsoft.com/office/word/2012/wordml" xmlns:w16cex="http://schemas.microsoft.com/office/word/2018/wordml/cex" xmlns:w16cid="http://schemas.microsoft.com/office/word/2016/wordml/cid" xmlns:w16="http://schemas.microsoft.com/office/word/2018/wordml" xmlns:w16du="http://schemas.microsoft.com/office/word/2023/wordml/word16du" xmlns:w16sdtdh="http://schemas.microsoft.com/office/word/2020/wordml/sdtdatahash" xmlns:w16se="http://schemas.microsoft.com/office/word/2015/wordml/symex" xmlns:wpg="http://schemas.microsoft.com/office/word/2010/wordprocessingGroup" xmlns:wpi="http://schemas.microsoft.com/office/word/2010/wordprocessingInk" xmlns:wne="http://schemas.microsoft.com/office/word/2006/wordml" xmlns:wps="http://schemas.microsoft.com/office/word/2010/wordprocessingShape" mc:Ignorable="w14 w15 w16se w16cid w16 w16cex w16sdtdh w16du wp14">
+<w:document xmlns:wpc="http://schemas.microsoft.com/office/word/2010/wordprocessingCanvas" xmlns:cx="http://schemas.microsoft.com/office/drawing/2014/chartex" xmlns:cx1="http://schemas.microsoft.com/office/drawing/2015/9/8/chartex" xmlns:cx2="http://schemas.microsoft.com/office/drawing/2015/10/21/chartex" xmlns:cx3="http://schemas.microsoft.com/office/drawing/2016/5/9/chartex" xmlns:cx4="http://schemas.microsoft.com/office/drawing/2016/5/10/chartex" xmlns:cx5="http://schemas.microsoft.com/office/drawing/2016/5/11/chartex" xmlns:cx6="http://schemas.microsoft.com/office/drawing/2016/5/12/chartex" xmlns:cx7="http://schemas.microsoft.com/office/drawing/2016/5/13/chartex" xmlns:cx8="http://schemas.microsoft.com/office/drawing/2016/5/14/chartex" xmlns:mc="http://schemas.openxmlformats.org/markup-compatibility/2006" xmlns:aink="http://schemas.microsoft.com/office/drawing/2016/ink" xmlns:am3d="http://schemas.microsoft.com/office/drawing/2017/model3d" xmlns:o="urn:schemas-microsoft-com:office:office" xmlns:oel="http://schemas.microsoft.com/office/2019/extlst" xmlns:r="http://schemas.openxmlformats.org/officeDocument/2006/relationships" xmlns:m="http://schemas.openxmlformats.org/officeDocument/2006/math" xmlns:v="urn:schemas-microsoft-com:vml" xmlns:wp14="http://schemas.microsoft.com/office/word/2010/wordprocessingDrawing" xmlns:wp="http://schemas.openxmlformats.org/drawingml/2006/wordprocessingDrawing" xmlns:w10="urn:schemas-microsoft-com:office:word" xmlns:w="http://schemas.openxmlformats.org/wordprocessingml/2006/main" xmlns:w14="http://schemas.microsoft.com/office/word/2010/wordml" xmlns:w15="http://schemas.microsoft.com/office/word/2012/wordml" xmlns:w16cex="http://schemas.microsoft.com/office/word/2018/wordml/cex" xmlns:w16cid="http://schemas.microsoft.com/office/word/2016/wordml/cid" xmlns:w16="http://schemas.microsoft.com/office/word/2018/wordml" xmlns:w16du="http://schemas.microsoft.com/office/word/2023/wordml/word16du" xmlns:w16sdtdh="http://schemas.microsoft.com/office/word/2020/wordml/sdtdatahash" xmlns:w16sdtfl="http://schemas.microsoft.com/office/word/2024/wordml/sdtformatlock" xmlns:w16se="http://schemas.microsoft.com/office/word/2015/wordml/symex" xmlns:wpg="http://schemas.microsoft.com/office/word/2010/wordprocessingGroup" xmlns:wpi="http://schemas.microsoft.com/office/word/2010/wordprocessingInk" xmlns:wne="http://schemas.microsoft.com/office/word/2006/wordml" xmlns:wps="http://schemas.microsoft.com/office/word/2010/wordprocessingShape" mc:Ignorable="w14 w15 w16se w16cid w16 w16cex w16sdtdh w16sdtfl w16du wp14">
   <w:body>
     <w:tbl>
       <w:tblPr>
@@ -33,7 +33,6 @@
           <w:tcPr>
             <w:tcW w:w="5860" w:type="dxa"/>
             <w:gridSpan w:val="2"/>
-            <w:shd w:val="clear" w:color="auto" w:fill="auto"/>
             <w:hideMark/>
           </w:tcPr>
           <w:p>
@@ -52,7 +51,6 @@
         <w:tc>
           <w:tcPr>
             <w:tcW w:w="3600" w:type="dxa"/>
-            <w:shd w:val="clear" w:color="auto" w:fill="auto"/>
             <w:hideMark/>
           </w:tcPr>
           <w:p>
@@ -80,7 +78,6 @@
         <w:tc>
           <w:tcPr>
             <w:tcW w:w="3067" w:type="dxa"/>
-            <w:shd w:val="clear" w:color="auto" w:fill="auto"/>
             <w:hideMark/>
           </w:tcPr>
           <w:p>
@@ -120,7 +117,6 @@
         <w:tc>
           <w:tcPr>
             <w:tcW w:w="2793" w:type="dxa"/>
-            <w:shd w:val="clear" w:color="auto" w:fill="auto"/>
             <w:hideMark/>
           </w:tcPr>
           <w:p>
@@ -161,7 +157,6 @@
         <w:tc>
           <w:tcPr>
             <w:tcW w:w="3600" w:type="dxa"/>
-            <w:shd w:val="clear" w:color="auto" w:fill="auto"/>
             <w:hideMark/>
           </w:tcPr>
           <w:p>
@@ -817,17 +812,6 @@
           <w:szCs w:val="23"/>
         </w:rPr>
       </w:pPr>
-      <w:r>
-        <w:rPr>
-          <w:rFonts w:cs="Times New Roman"/>
-          <w:noProof/>
-          <w:sz w:val="23"/>
-          <w:szCs w:val="23"/>
-        </w:rPr>
-        <w:pict w14:anchorId="1DDDCE22">
-          <v:rect id="_x0000_i1025" alt="" style="width:468pt;height:.05pt;mso-width-percent:0;mso-height-percent:0;mso-width-percent:0;mso-height-percent:0" o:hralign="center" o:hrstd="t" o:hr="t" fillcolor="#a0a0a0" stroked="f"/>
-        </w:pict>
-      </w:r>
     </w:p>
     <w:p>
       <w:pPr>
@@ -1350,7 +1334,7 @@
 </file>
 
 <file path=word/numbering.xml><?xml version="1.0" encoding="utf-8"?>
-<w:numbering xmlns:wpc="http://schemas.microsoft.com/office/word/2010/wordprocessingCanvas" xmlns:cx="http://schemas.microsoft.com/office/drawing/2014/chartex" xmlns:cx1="http://schemas.microsoft.com/office/drawing/2015/9/8/chartex" xmlns:cx2="http://schemas.microsoft.com/office/drawing/2015/10/21/chartex" xmlns:cx3="http://schemas.microsoft.com/office/drawing/2016/5/9/chartex" xmlns:cx4="http://schemas.microsoft.com/office/drawing/2016/5/10/chartex" xmlns:cx5="http://schemas.microsoft.com/office/drawing/2016/5/11/chartex" xmlns:cx6="http://schemas.microsoft.com/office/drawing/2016/5/12/chartex" xmlns:cx7="http://schemas.microsoft.com/office/drawing/2016/5/13/chartex" xmlns:cx8="http://schemas.microsoft.com/office/drawing/2016/5/14/chartex" xmlns:mc="http://schemas.openxmlformats.org/markup-compatibility/2006" xmlns:aink="http://schemas.microsoft.com/office/drawing/2016/ink" xmlns:am3d="http://schemas.microsoft.com/office/drawing/2017/model3d" xmlns:o="urn:schemas-microsoft-com:office:office" xmlns:oel="http://schemas.microsoft.com/office/2019/extlst" xmlns:r="http://schemas.openxmlformats.org/officeDocument/2006/relationships" xmlns:m="http://schemas.openxmlformats.org/officeDocument/2006/math" xmlns:v="urn:schemas-microsoft-com:vml" xmlns:wp14="http://schemas.microsoft.com/office/word/2010/wordprocessingDrawing" xmlns:wp="http://schemas.openxmlformats.org/drawingml/2006/wordprocessingDrawing" xmlns:w10="urn:schemas-microsoft-com:office:word" xmlns:w="http://schemas.openxmlformats.org/wordprocessingml/2006/main" xmlns:w14="http://schemas.microsoft.com/office/word/2010/wordml" xmlns:w15="http://schemas.microsoft.com/office/word/2012/wordml" xmlns:w16cex="http://schemas.microsoft.com/office/word/2018/wordml/cex" xmlns:w16cid="http://schemas.microsoft.com/office/word/2016/wordml/cid" xmlns:w16="http://schemas.microsoft.com/office/word/2018/wordml" xmlns:w16du="http://schemas.microsoft.com/office/word/2023/wordml/word16du" xmlns:w16sdtdh="http://schemas.microsoft.com/office/word/2020/wordml/sdtdatahash" xmlns:w16se="http://schemas.microsoft.com/office/word/2015/wordml/symex" xmlns:wpg="http://schemas.microsoft.com/office/word/2010/wordprocessingGroup" xmlns:wpi="http://schemas.microsoft.com/office/word/2010/wordprocessingInk" xmlns:wne="http://schemas.microsoft.com/office/word/2006/wordml" xmlns:wps="http://schemas.microsoft.com/office/word/2010/wordprocessingShape" mc:Ignorable="w14 w15 w16se w16cid w16 w16cex w16sdtdh w16du wp14">
+<w:numbering xmlns:wpc="http://schemas.microsoft.com/office/word/2010/wordprocessingCanvas" xmlns:cx="http://schemas.microsoft.com/office/drawing/2014/chartex" xmlns:cx1="http://schemas.microsoft.com/office/drawing/2015/9/8/chartex" xmlns:cx2="http://schemas.microsoft.com/office/drawing/2015/10/21/chartex" xmlns:cx3="http://schemas.microsoft.com/office/drawing/2016/5/9/chartex" xmlns:cx4="http://schemas.microsoft.com/office/drawing/2016/5/10/chartex" xmlns:cx5="http://schemas.microsoft.com/office/drawing/2016/5/11/chartex" xmlns:cx6="http://schemas.microsoft.com/office/drawing/2016/5/12/chartex" xmlns:cx7="http://schemas.microsoft.com/office/drawing/2016/5/13/chartex" xmlns:cx8="http://schemas.microsoft.com/office/drawing/2016/5/14/chartex" xmlns:mc="http://schemas.openxmlformats.org/markup-compatibility/2006" xmlns:aink="http://schemas.microsoft.com/office/drawing/2016/ink" xmlns:am3d="http://schemas.microsoft.com/office/drawing/2017/model3d" xmlns:o="urn:schemas-microsoft-com:office:office" xmlns:oel="http://schemas.microsoft.com/office/2019/extlst" xmlns:r="http://schemas.openxmlformats.org/officeDocument/2006/relationships" xmlns:m="http://schemas.openxmlformats.org/officeDocument/2006/math" xmlns:v="urn:schemas-microsoft-com:vml" xmlns:wp14="http://schemas.microsoft.com/office/word/2010/wordprocessingDrawing" xmlns:wp="http://schemas.openxmlformats.org/drawingml/2006/wordprocessingDrawing" xmlns:w10="urn:schemas-microsoft-com:office:word" xmlns:w="http://schemas.openxmlformats.org/wordprocessingml/2006/main" xmlns:w14="http://schemas.microsoft.com/office/word/2010/wordml" xmlns:w15="http://schemas.microsoft.com/office/word/2012/wordml" xmlns:w16cex="http://schemas.microsoft.com/office/word/2018/wordml/cex" xmlns:w16cid="http://schemas.microsoft.com/office/word/2016/wordml/cid" xmlns:w16="http://schemas.microsoft.com/office/word/2018/wordml" xmlns:w16du="http://schemas.microsoft.com/office/word/2023/wordml/word16du" xmlns:w16sdtdh="http://schemas.microsoft.com/office/word/2020/wordml/sdtdatahash" xmlns:w16sdtfl="http://schemas.microsoft.com/office/word/2024/wordml/sdtformatlock" xmlns:w16se="http://schemas.microsoft.com/office/word/2015/wordml/symex" xmlns:wpg="http://schemas.microsoft.com/office/word/2010/wordprocessingGroup" xmlns:wpi="http://schemas.microsoft.com/office/word/2010/wordprocessingInk" xmlns:wne="http://schemas.microsoft.com/office/word/2006/wordml" xmlns:wps="http://schemas.microsoft.com/office/word/2010/wordprocessingShape" mc:Ignorable="w14 w15 w16se w16cid w16 w16cex w16sdtdh w16sdtfl w16du wp14">
   <w:abstractNum w:abstractNumId="0" w15:restartNumberingAfterBreak="0">
     <w:nsid w:val="1C7C79D6"/>
     <w:multiLevelType w:val="hybridMultilevel"/>
@@ -1470,7 +1454,7 @@
 </file>
 
 <file path=word/styles.xml><?xml version="1.0" encoding="utf-8"?>
-<w:styles xmlns:mc="http://schemas.openxmlformats.org/markup-compatibility/2006" xmlns:r="http://schemas.openxmlformats.org/officeDocument/2006/relationships" xmlns:w="http://schemas.openxmlformats.org/wordprocessingml/2006/main" xmlns:w14="http://schemas.microsoft.com/office/word/2010/wordml" xmlns:w15="http://schemas.microsoft.com/office/word/2012/wordml" xmlns:w16cex="http://schemas.microsoft.com/office/word/2018/wordml/cex" xmlns:w16cid="http://schemas.microsoft.com/office/word/2016/wordml/cid" xmlns:w16="http://schemas.microsoft.com/office/word/2018/wordml" xmlns:w16du="http://schemas.microsoft.com/office/word/2023/wordml/word16du" xmlns:w16sdtdh="http://schemas.microsoft.com/office/word/2020/wordml/sdtdatahash" xmlns:w16se="http://schemas.microsoft.com/office/word/2015/wordml/symex" mc:Ignorable="w14 w15 w16se w16cid w16 w16cex w16sdtdh w16du">
+<w:styles xmlns:mc="http://schemas.openxmlformats.org/markup-compatibility/2006" xmlns:r="http://schemas.openxmlformats.org/officeDocument/2006/relationships" xmlns:w="http://schemas.openxmlformats.org/wordprocessingml/2006/main" xmlns:w14="http://schemas.microsoft.com/office/word/2010/wordml" xmlns:w15="http://schemas.microsoft.com/office/word/2012/wordml" xmlns:w16cex="http://schemas.microsoft.com/office/word/2018/wordml/cex" xmlns:w16cid="http://schemas.microsoft.com/office/word/2016/wordml/cid" xmlns:w16="http://schemas.microsoft.com/office/word/2018/wordml" xmlns:w16du="http://schemas.microsoft.com/office/word/2023/wordml/word16du" xmlns:w16sdtdh="http://schemas.microsoft.com/office/word/2020/wordml/sdtdatahash" xmlns:w16sdtfl="http://schemas.microsoft.com/office/word/2024/wordml/sdtformatlock" xmlns:w16se="http://schemas.microsoft.com/office/word/2015/wordml/symex" mc:Ignorable="w14 w15 w16se w16cid w16 w16cex w16sdtdh w16sdtfl w16du">
   <w:docDefaults>
     <w:rPrDefault>
       <w:rPr>
@@ -2687,6 +2671,17 @@
 </file>
 
 <file path=customXml/item1.xml><?xml version="1.0" encoding="utf-8"?>
+<p:properties xmlns:p="http://schemas.microsoft.com/office/2006/metadata/properties" xmlns:xsi="http://www.w3.org/2001/XMLSchema-instance" xmlns:pc="http://schemas.microsoft.com/office/infopath/2007/PartnerControls">
+  <documentManagement>
+    <TaxCatchAll xmlns="7dbd75cb-e23e-4bbb-9662-1ab6b6f3550b" xsi:nil="true"/>
+    <lcf76f155ced4ddcb4097134ff3c332f xmlns="dc24c30d-cbd4-4968-aaed-12d3995df8af">
+      <Terms xmlns="http://schemas.microsoft.com/office/infopath/2007/PartnerControls"/>
+    </lcf76f155ced4ddcb4097134ff3c332f>
+  </documentManagement>
+</p:properties>
+</file>
+
+<file path=customXml/item2.xml><?xml version="1.0" encoding="utf-8"?>
 <ct:contentTypeSchema xmlns:ct="http://schemas.microsoft.com/office/2006/metadata/contentType" xmlns:ma="http://schemas.microsoft.com/office/2006/metadata/properties/metaAttributes" ct:_="" ma:_="" ma:contentTypeName="Document" ma:contentTypeID="0x01010080965809FF228B4C891978F4CC8DB90B" ma:contentTypeVersion="11" ma:contentTypeDescription="Create a new document." ma:contentTypeScope="" ma:versionID="9ee31b75c5c0e89a67b180aa082719ea">
   <xsd:schema xmlns:xsd="http://www.w3.org/2001/XMLSchema" xmlns:xs="http://www.w3.org/2001/XMLSchema" xmlns:p="http://schemas.microsoft.com/office/2006/metadata/properties" xmlns:ns2="dc24c30d-cbd4-4968-aaed-12d3995df8af" xmlns:ns3="7dbd75cb-e23e-4bbb-9662-1ab6b6f3550b" targetNamespace="http://schemas.microsoft.com/office/2006/metadata/properties" ma:root="true" ma:fieldsID="b351d59c7eafa99f19ad533848da8b9e" ns2:_="" ns3:_="">
     <xsd:import namespace="dc24c30d-cbd4-4968-aaed-12d3995df8af"/>
@@ -2879,17 +2874,6 @@
 </ct:contentTypeSchema>
 </file>
 
-<file path=customXml/item2.xml><?xml version="1.0" encoding="utf-8"?>
-<p:properties xmlns:p="http://schemas.microsoft.com/office/2006/metadata/properties" xmlns:xsi="http://www.w3.org/2001/XMLSchema-instance" xmlns:pc="http://schemas.microsoft.com/office/infopath/2007/PartnerControls">
-  <documentManagement>
-    <TaxCatchAll xmlns="7dbd75cb-e23e-4bbb-9662-1ab6b6f3550b" xsi:nil="true"/>
-    <lcf76f155ced4ddcb4097134ff3c332f xmlns="dc24c30d-cbd4-4968-aaed-12d3995df8af">
-      <Terms xmlns="http://schemas.microsoft.com/office/infopath/2007/PartnerControls"/>
-    </lcf76f155ced4ddcb4097134ff3c332f>
-  </documentManagement>
-</p:properties>
-</file>
-
 <file path=customXml/item3.xml><?xml version="1.0" encoding="utf-8"?>
 <?mso-contentType ?>
 <FormTemplates xmlns="http://schemas.microsoft.com/sharepoint/v3/contenttype/forms">
@@ -2900,6 +2884,17 @@
 </file>
 
 <file path=customXml/itemProps1.xml><?xml version="1.0" encoding="utf-8"?>
+<ds:datastoreItem xmlns:ds="http://schemas.openxmlformats.org/officeDocument/2006/customXml" ds:itemID="{A3BDB483-78BC-4091-B587-1B14BDBD3F27}">
+  <ds:schemaRefs>
+    <ds:schemaRef ds:uri="http://schemas.microsoft.com/office/2006/metadata/properties"/>
+    <ds:schemaRef ds:uri="http://schemas.microsoft.com/office/infopath/2007/PartnerControls"/>
+    <ds:schemaRef ds:uri="7dbd75cb-e23e-4bbb-9662-1ab6b6f3550b"/>
+    <ds:schemaRef ds:uri="dc24c30d-cbd4-4968-aaed-12d3995df8af"/>
+  </ds:schemaRefs>
+</ds:datastoreItem>
+</file>
+
+<file path=customXml/itemProps2.xml><?xml version="1.0" encoding="utf-8"?>
 <ds:datastoreItem xmlns:ds="http://schemas.openxmlformats.org/officeDocument/2006/customXml" ds:itemID="{812B2A79-7BE1-4B07-BC31-6C95391CC4E9}">
   <ds:schemaRefs>
     <ds:schemaRef ds:uri="http://schemas.microsoft.com/office/2006/metadata/contentType"/>
@@ -2918,17 +2913,6 @@
 </ds:datastoreItem>
 </file>
 
-<file path=customXml/itemProps2.xml><?xml version="1.0" encoding="utf-8"?>
-<ds:datastoreItem xmlns:ds="http://schemas.openxmlformats.org/officeDocument/2006/customXml" ds:itemID="{A3BDB483-78BC-4091-B587-1B14BDBD3F27}">
-  <ds:schemaRefs>
-    <ds:schemaRef ds:uri="http://schemas.microsoft.com/office/2006/metadata/properties"/>
-    <ds:schemaRef ds:uri="http://schemas.microsoft.com/office/infopath/2007/PartnerControls"/>
-    <ds:schemaRef ds:uri="7dbd75cb-e23e-4bbb-9662-1ab6b6f3550b"/>
-    <ds:schemaRef ds:uri="dc24c30d-cbd4-4968-aaed-12d3995df8af"/>
-  </ds:schemaRefs>
-</ds:datastoreItem>
-</file>
-
 <file path=customXml/itemProps3.xml><?xml version="1.0" encoding="utf-8"?>
 <ds:datastoreItem xmlns:ds="http://schemas.openxmlformats.org/officeDocument/2006/customXml" ds:itemID="{7356013E-E668-44D2-BAD5-81EAC76842CD}">
   <ds:schemaRefs>

</xml_diff>